<commit_message>
updated menu with slides
</commit_message>
<xml_diff>
--- a/docs/group-tasks/week-3/PA-3-task-card.docx
+++ b/docs/group-tasks/week-3/PA-3-task-card.docx
@@ -7,49 +7,7 @@
         <w:pStyle w:val="Title"/>
       </w:pPr>
       <w:r>
-        <w:t xml:space="preserve">PA</w:t>
-      </w:r>
-      <w:r>
-        <w:t xml:space="preserve"> </w:t>
-      </w:r>
-      <w:r>
-        <w:t xml:space="preserve">3</w:t>
-      </w:r>
-      <w:r>
-        <w:t xml:space="preserve"> </w:t>
-      </w:r>
-      <w:r>
-        <w:t xml:space="preserve">Task</w:t>
-      </w:r>
-      <w:r>
-        <w:t xml:space="preserve"> </w:t>
-      </w:r>
-      <w:r>
-        <w:t xml:space="preserve">Card</w:t>
-      </w:r>
-      <w:r>
-        <w:t xml:space="preserve"> </w:t>
-      </w:r>
-      <w:r>
-        <w:t xml:space="preserve">–</w:t>
-      </w:r>
-      <w:r>
-        <w:t xml:space="preserve"> </w:t>
-      </w:r>
-      <w:r>
-        <w:t xml:space="preserve">Finding</w:t>
-      </w:r>
-      <w:r>
-        <w:t xml:space="preserve"> </w:t>
-      </w:r>
-      <w:r>
-        <w:t xml:space="preserve">Ephelia’s</w:t>
-      </w:r>
-      <w:r>
-        <w:t xml:space="preserve"> </w:t>
-      </w:r>
-      <w:r>
-        <w:t xml:space="preserve">College</w:t>
+        <w:t xml:space="preserve">PA 3 Task Card – Finding Ephelia’s College</w:t>
       </w:r>
     </w:p>
     <w:p>
@@ -758,13 +716,7 @@
         <w:t xml:space="preserve"> </w:t>
       </w:r>
       <w:r>
-        <w:t xml:space="preserve">“</w:t>
-      </w:r>
-      <w:r>
-        <w:t xml:space="preserve">tidy</w:t>
-      </w:r>
-      <w:r>
-        <w:t xml:space="preserve">”</w:t>
+        <w:t xml:space="preserve">“tidy”</w:t>
       </w:r>
       <w:r>
         <w:t xml:space="preserve"> </w:t>
@@ -776,13 +728,7 @@
         <w:t xml:space="preserve"> </w:t>
       </w:r>
       <w:r>
-        <w:t xml:space="preserve">“</w:t>
-      </w:r>
-      <w:r>
-        <w:t xml:space="preserve">well documented</w:t>
-      </w:r>
-      <w:r>
-        <w:t xml:space="preserve">”</w:t>
+        <w:t xml:space="preserve">“well documented”</w:t>
       </w:r>
       <w:r>
         <w:t xml:space="preserve"> </w:t>
@@ -1397,7 +1343,7 @@
   </w:style>
   <w:style w:styleId="Subtitle" w:type="paragraph">
     <w:name w:val="Subtitle"/>
-    <w:basedOn w:val="Normal"/>
+    <w:basedOn w:val="Title"/>
     <w:next w:val="BodyText"/>
     <w:link w:val="SubtitleChar"/>
     <w:uiPriority w:val="11"/>
@@ -1410,7 +1356,6 @@
     </w:pPr>
     <w:rPr>
       <w:rFonts w:cstheme="majorBidi" w:eastAsiaTheme="majorEastAsia"/>
-      <w:color w:themeColor="text1" w:themeTint="A6" w:val="595959"/>
       <w:spacing w:val="15"/>
       <w:sz w:val="28"/>
       <w:szCs w:val="28"/>
@@ -1463,7 +1408,6 @@
     </w:pPr>
     <w:rPr>
       <w:b/>
-      <w:color w:val="345A8A"/>
       <w:sz w:val="20"/>
       <w:szCs w:val="20"/>
     </w:rPr>

</xml_diff>